<commit_message>
Add 2026 achievements (ENVU, audit, automation) to summary
</commit_message>
<xml_diff>
--- a/Achievements_2025.docx
+++ b/Achievements_2025.docx
@@ -5,7 +5,6 @@
     <w:p>
       <w:pPr>
         <w:spacing w:after="40"/>
-        <w:jc w:val="left"/>
       </w:pPr>
       <w:r>
         <w:rPr>
@@ -13,7 +12,7 @@
           <w:color w:val="1F3864"/>
           <w:sz w:val="48"/>
         </w:rPr>
-        <w:t>Key Achievements — 2025</w:t>
+        <w:t>Key Achievements</w:t>
       </w:r>
     </w:p>
     <w:p>
@@ -26,7 +25,7 @@
           <w:color w:val="2E75B6"/>
           <w:sz w:val="24"/>
         </w:rPr>
-        <w:t>Performance Highlights | H2 2025 &amp; H1 2026</w:t>
+        <w:t>Performance Highlights | 2025 &amp; 2026</w:t>
       </w:r>
     </w:p>
     <w:p>
@@ -37,11 +36,51 @@
         <w:spacing w:after="200"/>
       </w:pPr>
     </w:p>
+    <w:tbl>
+      <w:tblPr>
+        <w:tblW w:type="auto" w:w="0"/>
+        <w:jc w:val="center"/>
+        <w:tblLook w:firstColumn="1" w:firstRow="1" w:lastColumn="0" w:lastRow="0" w:noHBand="0" w:noVBand="1" w:val="04A0"/>
+      </w:tblPr>
+      <w:tblGrid>
+        <w:gridCol w:w="9936"/>
+      </w:tblGrid>
+      <w:tr>
+        <w:tc>
+          <w:tcPr>
+            <w:tcW w:type="dxa" w:w="9936"/>
+            <w:shd w:val="clear" w:color="auto" w:fill="1F3864"/>
+            <w:tcMar>
+              <w:top w:w="100" w:type="dxa"/>
+              <w:bottom w:w="100" w:type="dxa"/>
+              <w:start w:w="160" w:type="dxa"/>
+              <w:end w:w="160" w:type="dxa"/>
+            </w:tcMar>
+          </w:tcPr>
+          <w:p>
+            <w:r/>
+            <w:r>
+              <w:rPr>
+                <w:b/>
+                <w:color w:val="FFFFFF"/>
+                <w:sz w:val="32"/>
+              </w:rPr>
+              <w:t>2025</w:t>
+            </w:r>
+          </w:p>
+        </w:tc>
+      </w:tr>
+    </w:tbl>
+    <w:p>
+      <w:pPr>
+        <w:spacing w:after="40"/>
+      </w:pPr>
+    </w:p>
     <w:p>
       <w:pPr>
         <w:spacing w:before="240" w:after="80"/>
         <w:pBdr>
-          <w:bottom w:val="single" w:sz="6" w:space="2" w:color="D0D7E5"/>
+          <w:bottom w:val="single" w:sz="6" w:space="1" w:color="D0D7E5"/>
         </w:pBdr>
       </w:pPr>
       <w:r>
@@ -113,7 +152,7 @@
       <w:pPr>
         <w:spacing w:before="240" w:after="80"/>
         <w:pBdr>
-          <w:bottom w:val="single" w:sz="6" w:space="2" w:color="D0D7E5"/>
+          <w:bottom w:val="single" w:sz="6" w:space="1" w:color="D0D7E5"/>
         </w:pBdr>
       </w:pPr>
       <w:r>
@@ -271,7 +310,7 @@
       <w:pPr>
         <w:spacing w:before="240" w:after="80"/>
         <w:pBdr>
-          <w:bottom w:val="single" w:sz="6" w:space="2" w:color="D0D7E5"/>
+          <w:bottom w:val="single" w:sz="6" w:space="1" w:color="D0D7E5"/>
         </w:pBdr>
       </w:pPr>
       <w:r>
@@ -387,7 +426,7 @@
       <w:pPr>
         <w:spacing w:before="240" w:after="80"/>
         <w:pBdr>
-          <w:bottom w:val="single" w:sz="6" w:space="2" w:color="D0D7E5"/>
+          <w:bottom w:val="single" w:sz="6" w:space="1" w:color="D0D7E5"/>
         </w:pBdr>
       </w:pPr>
       <w:r>
@@ -438,46 +477,7 @@
           <w:b w:val="0"/>
           <w:sz w:val="22"/>
         </w:rPr>
-        <w:t>Created the media plan</w:t>
-      </w:r>
-    </w:p>
-    <w:p>
-      <w:pPr>
-        <w:pStyle w:val="ListBullet"/>
-        <w:spacing w:after="60"/>
-      </w:pPr>
-      <w:r>
-        <w:rPr>
-          <w:b w:val="0"/>
-          <w:sz w:val="22"/>
-        </w:rPr>
-        <w:t>Allocated avails and scaled</w:t>
-      </w:r>
-    </w:p>
-    <w:p>
-      <w:pPr>
-        <w:pStyle w:val="ListBullet"/>
-        <w:spacing w:after="60"/>
-      </w:pPr>
-      <w:r>
-        <w:rPr>
-          <w:b w:val="0"/>
-          <w:sz w:val="22"/>
-        </w:rPr>
-        <w:t>Built the line items</w:t>
-      </w:r>
-    </w:p>
-    <w:p>
-      <w:pPr>
-        <w:pStyle w:val="ListBullet"/>
-        <w:spacing w:after="60"/>
-      </w:pPr>
-      <w:r>
-        <w:rPr>
-          <w:b w:val="0"/>
-          <w:sz w:val="22"/>
-        </w:rPr>
-        <w:t>Reached out to the demand partner</w:t>
+        <w:t>Created the media plan, allocated avails, scaled, built line items, and reached out to the demand partner.</w:t>
       </w:r>
     </w:p>
     <w:p>
@@ -531,14 +531,14 @@
           <w:i/>
           <w:sz w:val="22"/>
         </w:rPr>
-        <w:t>Note: This ran on a separate thread with no team visibility (VIZ).</w:t>
+        <w:t>Note: ran on a separate thread with no team visibility (VIZ).</w:t>
       </w:r>
     </w:p>
     <w:p>
       <w:pPr>
         <w:spacing w:before="240" w:after="80"/>
         <w:pBdr>
-          <w:bottom w:val="single" w:sz="6" w:space="2" w:color="D0D7E5"/>
+          <w:bottom w:val="single" w:sz="6" w:space="1" w:color="D0D7E5"/>
         </w:pBdr>
       </w:pPr>
       <w:r>
@@ -580,14 +580,14 @@
           <w:b/>
           <w:sz w:val="22"/>
         </w:rPr>
-        <w:t>All of the above delivered as a single resource, without any backup.</w:t>
+        <w:t>All delivered as a single resource, without any backup.</w:t>
       </w:r>
     </w:p>
     <w:p>
       <w:pPr>
         <w:spacing w:before="240" w:after="80"/>
         <w:pBdr>
-          <w:bottom w:val="single" w:sz="6" w:space="2" w:color="D0D7E5"/>
+          <w:bottom w:val="single" w:sz="6" w:space="1" w:color="D0D7E5"/>
         </w:pBdr>
       </w:pPr>
       <w:r>
@@ -623,7 +623,27 @@
           <w:b w:val="0"/>
           <w:sz w:val="22"/>
         </w:rPr>
-        <w:t xml:space="preserve"> for the Nativo team.</w:t>
+        <w:t xml:space="preserve"> for the Nativo team; produced clear docs on how the SSP works and on roles &amp; responsibilities.</w:t>
+      </w:r>
+    </w:p>
+    <w:p>
+      <w:pPr>
+        <w:pStyle w:val="ListBullet"/>
+        <w:spacing w:after="60"/>
+      </w:pPr>
+      <w:r>
+        <w:rPr>
+          <w:b/>
+          <w:sz w:val="22"/>
+        </w:rPr>
+        <w:t>Analysis delivered:</w:t>
+      </w:r>
+      <w:r>
+        <w:rPr>
+          <w:b w:val="0"/>
+          <w:sz w:val="22"/>
+        </w:rPr>
+        <w:t xml:space="preserve"> zero-bid, timeout, partner mismatch, ads.txt optimizations (only top lines), and domain connection miss.</w:t>
       </w:r>
     </w:p>
     <w:p>
@@ -636,20 +656,111 @@
           <w:b w:val="0"/>
           <w:sz w:val="22"/>
         </w:rPr>
-        <w:t>Produced clear documentation on how the SSP works and on roles &amp; responsibilities.</w:t>
+        <w:t xml:space="preserve">Built a </w:t>
+      </w:r>
+      <w:r>
+        <w:rPr>
+          <w:b/>
+          <w:sz w:val="22"/>
+        </w:rPr>
+        <w:t>daily monitoring dashboard</w:t>
+      </w:r>
+      <w:r>
+        <w:rPr>
+          <w:b w:val="0"/>
+          <w:sz w:val="22"/>
+        </w:rPr>
+        <w:t xml:space="preserve"> so the team can review performance and save time; shared actionable optimizations.</w:t>
+      </w:r>
+    </w:p>
+    <w:p>
+      <w:r>
+        <w:br w:type="page"/>
+      </w:r>
+    </w:p>
+    <w:tbl>
+      <w:tblPr>
+        <w:tblW w:type="auto" w:w="0"/>
+        <w:jc w:val="center"/>
+        <w:tblLook w:firstColumn="1" w:firstRow="1" w:lastColumn="0" w:lastRow="0" w:noHBand="0" w:noVBand="1" w:val="04A0"/>
+      </w:tblPr>
+      <w:tblGrid>
+        <w:gridCol w:w="9936"/>
+      </w:tblGrid>
+      <w:tr>
+        <w:tc>
+          <w:tcPr>
+            <w:tcW w:type="dxa" w:w="9936"/>
+            <w:shd w:val="clear" w:color="auto" w:fill="1F3864"/>
+            <w:tcMar>
+              <w:top w:w="100" w:type="dxa"/>
+              <w:bottom w:w="100" w:type="dxa"/>
+              <w:start w:w="160" w:type="dxa"/>
+              <w:end w:w="160" w:type="dxa"/>
+            </w:tcMar>
+          </w:tcPr>
+          <w:p>
+            <w:r/>
+            <w:r>
+              <w:rPr>
+                <w:b/>
+                <w:color w:val="FFFFFF"/>
+                <w:sz w:val="32"/>
+              </w:rPr>
+              <w:t>2026</w:t>
+            </w:r>
+          </w:p>
+        </w:tc>
+      </w:tr>
+    </w:tbl>
+    <w:p>
+      <w:pPr>
+        <w:spacing w:after="40"/>
+      </w:pPr>
+    </w:p>
+    <w:p>
+      <w:pPr>
+        <w:spacing w:before="240" w:after="80"/>
+        <w:pBdr>
+          <w:bottom w:val="single" w:sz="6" w:space="1" w:color="D0D7E5"/>
+        </w:pBdr>
+      </w:pPr>
+      <w:r>
+        <w:rPr>
+          <w:b/>
+          <w:color w:val="1F3864"/>
+          <w:sz w:val="28"/>
+        </w:rPr>
+        <w:t>Headline</w:t>
       </w:r>
     </w:p>
     <w:p>
       <w:pPr>
-        <w:spacing w:before="120" w:after="40"/>
+        <w:spacing w:after="120"/>
       </w:pPr>
       <w:r>
         <w:rPr>
           <w:b/>
-          <w:color w:val="2E75B6"/>
-          <w:sz w:val="23"/>
+          <w:i w:val="0"/>
+          <w:sz w:val="22"/>
         </w:rPr>
-        <w:t>Analysis Delivered</w:t>
+        <w:t>Led the ENVU cross-platform initiative solo, owned the Ad Boost vs. Booster audit (praised by the client and CEO), and automated ~6 hours of recurring manual work per week — all while carrying a full inventory workload with no backup.</w:t>
+      </w:r>
+    </w:p>
+    <w:p>
+      <w:pPr>
+        <w:spacing w:before="240" w:after="80"/>
+        <w:pBdr>
+          <w:bottom w:val="single" w:sz="6" w:space="1" w:color="D0D7E5"/>
+        </w:pBdr>
+      </w:pPr>
+      <w:r>
+        <w:rPr>
+          <w:b/>
+          <w:color w:val="1F3864"/>
+          <w:sz w:val="28"/>
+        </w:rPr>
+        <w:t>PG &amp; PD Deals</w:t>
       </w:r>
     </w:p>
     <w:p>
@@ -662,33 +773,50 @@
           <w:b w:val="0"/>
           <w:sz w:val="22"/>
         </w:rPr>
-        <w:t>Zero-bid analysis</w:t>
+        <w:t xml:space="preserve">Strengthened the relationship with Brian and took on most of the optimizations, building trust that opened the team up to </w:t>
       </w:r>
-    </w:p>
-    <w:p>
-      <w:pPr>
-        <w:pStyle w:val="ListBullet"/>
-        <w:spacing w:after="60"/>
-      </w:pPr>
+      <w:r>
+        <w:rPr>
+          <w:b/>
+          <w:sz w:val="22"/>
+        </w:rPr>
+        <w:t>testing where we source resources</w:t>
+      </w:r>
       <w:r>
         <w:rPr>
           <w:b w:val="0"/>
           <w:sz w:val="22"/>
         </w:rPr>
-        <w:t>Timeout analysis</w:t>
+        <w:t>.</w:t>
       </w:r>
     </w:p>
     <w:p>
       <w:pPr>
-        <w:pStyle w:val="ListBullet"/>
-        <w:spacing w:after="60"/>
+        <w:spacing w:before="240" w:after="80"/>
+        <w:pBdr>
+          <w:bottom w:val="single" w:sz="6" w:space="1" w:color="D0D7E5"/>
+        </w:pBdr>
+      </w:pPr>
+      <w:r>
+        <w:rPr>
+          <w:b/>
+          <w:color w:val="1F3864"/>
+          <w:sz w:val="28"/>
+        </w:rPr>
+        <w:t>ENVU Project (Feb 2026) — Led Solo</w:t>
+      </w:r>
+    </w:p>
+    <w:p>
+      <w:pPr>
+        <w:spacing w:after="120"/>
       </w:pPr>
       <w:r>
         <w:rPr>
           <w:b w:val="0"/>
+          <w:i w:val="0"/>
           <w:sz w:val="22"/>
         </w:rPr>
-        <w:t>Partner mismatch analysis</w:t>
+        <w:t>A large cross-platform initiative spanning all our ad servers, focused on standardizing video-creation processes and building a single, reusable knowledge base for the ENVU account.</w:t>
       </w:r>
     </w:p>
     <w:p>
@@ -701,14 +829,14 @@
           <w:b/>
           <w:sz w:val="22"/>
         </w:rPr>
-        <w:t>Ads.txt optimizations</w:t>
+        <w:t xml:space="preserve">My role: </w:t>
       </w:r>
       <w:r>
         <w:rPr>
           <w:b w:val="0"/>
           <w:sz w:val="22"/>
         </w:rPr>
-        <w:t xml:space="preserve"> — restricted to surfacing only the top lines.</w:t>
+        <w:t>Led end-to-end, solo — with minimal help from the team and no dedicated support.</w:t>
       </w:r>
     </w:p>
     <w:p>
@@ -718,23 +846,17 @@
       </w:pPr>
       <w:r>
         <w:rPr>
+          <w:b/>
+          <w:sz w:val="22"/>
+        </w:rPr>
+        <w:t>Worked across all social platforms with no prior experience</w:t>
+      </w:r>
+      <w:r>
+        <w:rPr>
           <w:b w:val="0"/>
           <w:sz w:val="22"/>
         </w:rPr>
-        <w:t>Domain connection miss analysis</w:t>
-      </w:r>
-    </w:p>
-    <w:p>
-      <w:pPr>
-        <w:spacing w:before="120" w:after="40"/>
-      </w:pPr>
-      <w:r>
-        <w:rPr>
-          <w:b/>
-          <w:color w:val="2E75B6"/>
-          <w:sz w:val="23"/>
-        </w:rPr>
-        <w:t>Daily Monitoring Dashboard</w:t>
+        <w:t>, ramping up from scratch.</w:t>
       </w:r>
     </w:p>
     <w:p>
@@ -744,10 +866,17 @@
       </w:pPr>
       <w:r>
         <w:rPr>
+          <w:b/>
+          <w:sz w:val="22"/>
+        </w:rPr>
+        <w:t>Master playbooks</w:t>
+      </w:r>
+      <w:r>
+        <w:rPr>
           <w:b w:val="0"/>
           <w:sz w:val="22"/>
         </w:rPr>
-        <w:t>Built a daily monitoring dashboard so the team can review performance and save time.</w:t>
+        <w:t xml:space="preserve"> — Authored playbooks far beyond a standard playbook: optimizations, FAQs, glossaries, and step-by-step instructions with screenshots, built “idiot-proof” so anyone can set things up.</w:t>
       </w:r>
     </w:p>
     <w:p>
@@ -757,26 +886,31 @@
       </w:pPr>
       <w:r>
         <w:rPr>
+          <w:b/>
+          <w:sz w:val="22"/>
+        </w:rPr>
+        <w:t>Creative walkthrough videos</w:t>
+      </w:r>
+      <w:r>
+        <w:rPr>
           <w:b w:val="0"/>
           <w:sz w:val="22"/>
         </w:rPr>
-        <w:t>Shared recommended optimizations the team can act on.</w:t>
+        <w:t xml:space="preserve"> — Step-by-step videos for forms setup and campaign processes across every platform, with </w:t>
       </w:r>
-    </w:p>
-    <w:p>
-      <w:pPr>
-        <w:spacing w:before="240" w:after="80"/>
-        <w:pBdr>
-          <w:bottom w:val="single" w:sz="6" w:space="2" w:color="D0D7E5"/>
-        </w:pBdr>
-      </w:pPr>
       <w:r>
         <w:rPr>
           <w:b/>
-          <w:color w:val="1F3864"/>
-          <w:sz w:val="28"/>
+          <w:sz w:val="22"/>
         </w:rPr>
-        <w:t>Going Above &amp; Beyond</w:t>
+        <w:t>AI voice-over, subtitles</w:t>
+      </w:r>
+      <w:r>
+        <w:rPr>
+          <w:b w:val="0"/>
+          <w:sz w:val="22"/>
+        </w:rPr>
+        <w:t>, and clear explanations the client appreciated.</w:t>
       </w:r>
     </w:p>
     <w:p>
@@ -786,24 +920,17 @@
       </w:pPr>
       <w:r>
         <w:rPr>
-          <w:b w:val="0"/>
-          <w:sz w:val="22"/>
-        </w:rPr>
-        <w:t xml:space="preserve">Due to heavy client load and </w:t>
-      </w:r>
-      <w:r>
-        <w:rPr>
           <w:b/>
           <w:sz w:val="22"/>
         </w:rPr>
-        <w:t>no proper backup</w:t>
+        <w:t>Unified metrics &amp; dimensions matrix</w:t>
       </w:r>
       <w:r>
         <w:rPr>
           <w:b w:val="0"/>
           <w:sz w:val="22"/>
         </w:rPr>
-        <w:t>, I completely prioritized and owned the work.</w:t>
+        <w:t xml:space="preserve"> — A single reference reconciling how each platform defines key metrics (e.g., an “impression” differs by platform).</w:t>
       </w:r>
     </w:p>
     <w:p>
@@ -813,31 +940,395 @@
       </w:pPr>
       <w:r>
         <w:rPr>
+          <w:b/>
+          <w:sz w:val="22"/>
+        </w:rPr>
+        <w:t>Offline-events marketing form</w:t>
+      </w:r>
+      <w:r>
+        <w:rPr>
           <w:b w:val="0"/>
           <w:sz w:val="22"/>
         </w:rPr>
-        <w:t xml:space="preserve">Worked through my </w:t>
+        <w:t xml:space="preserve"> — Created the offline-events marketing form.</w:t>
+      </w:r>
+    </w:p>
+    <w:p>
+      <w:pPr>
+        <w:pStyle w:val="ListBullet"/>
+        <w:spacing w:after="60"/>
+      </w:pPr>
+      <w:r>
+        <w:rPr>
+          <w:b/>
+          <w:sz w:val="22"/>
+        </w:rPr>
+        <w:t xml:space="preserve">The hard part: </w:t>
+      </w:r>
+      <w:r>
+        <w:rPr>
+          <w:b w:val="0"/>
+          <w:sz w:val="22"/>
+        </w:rPr>
+        <w:t>Reconciling inconsistent metric definitions across platforms into one reliable reference — while carrying my full inventory workload in parallel, largely outside office hours and with no backup.</w:t>
+      </w:r>
+    </w:p>
+    <w:tbl>
+      <w:tblPr>
+        <w:tblW w:type="auto" w:w="0"/>
+        <w:jc w:val="center"/>
+        <w:tblLook w:firstColumn="1" w:firstRow="1" w:lastColumn="0" w:lastRow="0" w:noHBand="0" w:noVBand="1" w:val="04A0"/>
+      </w:tblPr>
+      <w:tblGrid>
+        <w:gridCol w:w="9936"/>
+      </w:tblGrid>
+      <w:tr>
+        <w:tc>
+          <w:tcPr>
+            <w:tcW w:type="dxa" w:w="9936"/>
+            <w:shd w:val="clear" w:color="auto" w:fill="EAF1FA"/>
+            <w:tcMar>
+              <w:top w:w="120" w:type="dxa"/>
+              <w:bottom w:w="120" w:type="dxa"/>
+              <w:start w:w="160" w:type="dxa"/>
+              <w:end w:w="160" w:type="dxa"/>
+            </w:tcMar>
+            <w:tcBorders>
+              <w:left w:val="single" w:sz="24" w:space="0" w:color="2E75B6"/>
+            </w:tcBorders>
+          </w:tcPr>
+          <w:p>
+            <w:r/>
+            <w:r>
+              <w:rPr>
+                <w:i/>
+                <w:color w:val="1F3864"/>
+                <w:sz w:val="22"/>
+              </w:rPr>
+              <w:t>Impact: A self-serve knowledge base that reduces dependency, speeds onboarding, and drives consistent execution across the team.</w:t>
+            </w:r>
+          </w:p>
+        </w:tc>
+      </w:tr>
+    </w:tbl>
+    <w:p>
+      <w:pPr>
+        <w:spacing w:after="80"/>
+      </w:pPr>
+    </w:p>
+    <w:p>
+      <w:pPr>
+        <w:spacing w:before="240" w:after="80"/>
+        <w:pBdr>
+          <w:bottom w:val="single" w:sz="6" w:space="1" w:color="D0D7E5"/>
+        </w:pBdr>
+      </w:pPr>
+      <w:r>
+        <w:rPr>
+          <w:b/>
+          <w:color w:val="1F3864"/>
+          <w:sz w:val="28"/>
+        </w:rPr>
+        <w:t>Ad Boost vs. Booster Audit — Owned End-to-End</w:t>
+      </w:r>
+    </w:p>
+    <w:p>
+      <w:pPr>
+        <w:spacing w:after="120"/>
+      </w:pPr>
+      <w:r>
+        <w:rPr>
+          <w:b w:val="0"/>
+          <w:i w:val="0"/>
+          <w:sz w:val="22"/>
+        </w:rPr>
+        <w:t>A side-by-side evaluation of two optimization platforms to determine the best fit for the client, delivered in parallel with ongoing client responsibilities.</w:t>
+      </w:r>
+    </w:p>
+    <w:p>
+      <w:pPr>
+        <w:pStyle w:val="ListBullet"/>
+        <w:spacing w:after="60"/>
+      </w:pPr>
+      <w:r>
+        <w:rPr>
+          <w:b/>
+          <w:sz w:val="22"/>
+        </w:rPr>
+        <w:t xml:space="preserve">My role: </w:t>
+      </w:r>
+      <w:r>
+        <w:rPr>
+          <w:b w:val="0"/>
+          <w:sz w:val="22"/>
+        </w:rPr>
+        <w:t>Owned it end-to-end — scoping, audit, and recommendation.</w:t>
+      </w:r>
+    </w:p>
+    <w:p>
+      <w:pPr>
+        <w:pStyle w:val="ListBullet"/>
+        <w:spacing w:after="60"/>
+      </w:pPr>
+      <w:r>
+        <w:rPr>
+          <w:b/>
+          <w:sz w:val="22"/>
+        </w:rPr>
+        <w:t xml:space="preserve">What I did: </w:t>
+      </w:r>
+      <w:r>
+        <w:rPr>
+          <w:b w:val="0"/>
+          <w:sz w:val="22"/>
+        </w:rPr>
+        <w:t>Assessed the full capabilities and optimizations of both platforms against client requirements, documented features, strengths, and suitability in depth, and recommended the platform to migrate to.</w:t>
+      </w:r>
+    </w:p>
+    <w:p>
+      <w:pPr>
+        <w:pStyle w:val="ListBullet"/>
+        <w:spacing w:after="60"/>
+      </w:pPr>
+      <w:r>
+        <w:rPr>
+          <w:b/>
+          <w:sz w:val="22"/>
+        </w:rPr>
+        <w:t xml:space="preserve">Impact: </w:t>
+      </w:r>
+      <w:r>
+        <w:rPr>
+          <w:b w:val="0"/>
+          <w:sz w:val="22"/>
+        </w:rPr>
+        <w:t>Gave leadership a clear, evidence-based migration decision.</w:t>
+      </w:r>
+    </w:p>
+    <w:tbl>
+      <w:tblPr>
+        <w:tblW w:type="auto" w:w="0"/>
+        <w:jc w:val="center"/>
+        <w:tblLook w:firstColumn="1" w:firstRow="1" w:lastColumn="0" w:lastRow="0" w:noHBand="0" w:noVBand="1" w:val="04A0"/>
+      </w:tblPr>
+      <w:tblGrid>
+        <w:gridCol w:w="9936"/>
+      </w:tblGrid>
+      <w:tr>
+        <w:tc>
+          <w:tcPr>
+            <w:tcW w:type="dxa" w:w="9936"/>
+            <w:shd w:val="clear" w:color="auto" w:fill="FBF3D9"/>
+            <w:tcMar>
+              <w:top w:w="120" w:type="dxa"/>
+              <w:bottom w:w="120" w:type="dxa"/>
+              <w:start w:w="160" w:type="dxa"/>
+              <w:end w:w="160" w:type="dxa"/>
+            </w:tcMar>
+            <w:tcBorders>
+              <w:left w:val="single" w:sz="24" w:space="0" w:color="B58B00"/>
+            </w:tcBorders>
+          </w:tcPr>
+          <w:p>
+            <w:r/>
+            <w:r>
+              <w:rPr>
+                <w:i/>
+                <w:color w:val="B58B00"/>
+                <w:sz w:val="22"/>
+              </w:rPr>
+              <w:t>Recognition: Appreciated by both the client and our CEO.</w:t>
+            </w:r>
+          </w:p>
+        </w:tc>
+      </w:tr>
+    </w:tbl>
+    <w:p>
+      <w:pPr>
+        <w:spacing w:after="80"/>
+      </w:pPr>
+    </w:p>
+    <w:p>
+      <w:pPr>
+        <w:spacing w:before="240" w:after="80"/>
+        <w:pBdr>
+          <w:bottom w:val="single" w:sz="6" w:space="1" w:color="D0D7E5"/>
+        </w:pBdr>
+      </w:pPr>
+      <w:r>
+        <w:rPr>
+          <w:b/>
+          <w:color w:val="1F3864"/>
+          <w:sz w:val="28"/>
+        </w:rPr>
+        <w:t>Enablement &amp; Training</w:t>
+      </w:r>
+    </w:p>
+    <w:p>
+      <w:pPr>
+        <w:pStyle w:val="ListBullet"/>
+        <w:spacing w:after="60"/>
+      </w:pPr>
+      <w:r>
+        <w:rPr>
+          <w:b/>
+          <w:sz w:val="22"/>
+        </w:rPr>
+        <w:t>Trained Pandey</w:t>
+      </w:r>
+      <w:r>
+        <w:rPr>
+          <w:b w:val="0"/>
+          <w:sz w:val="22"/>
+        </w:rPr>
+        <w:t xml:space="preserve"> in inventory management.</w:t>
+      </w:r>
+    </w:p>
+    <w:p>
+      <w:pPr>
+        <w:spacing w:before="240" w:after="80"/>
+        <w:pBdr>
+          <w:bottom w:val="single" w:sz="6" w:space="1" w:color="D0D7E5"/>
+        </w:pBdr>
+      </w:pPr>
+      <w:r>
+        <w:rPr>
+          <w:b/>
+          <w:color w:val="1F3864"/>
+          <w:sz w:val="28"/>
+        </w:rPr>
+        <w:t>Forecasting &amp; Allocation</w:t>
+      </w:r>
+    </w:p>
+    <w:p>
+      <w:pPr>
+        <w:pStyle w:val="ListBullet"/>
+        <w:spacing w:after="60"/>
+      </w:pPr>
+      <w:r>
+        <w:rPr>
+          <w:b/>
+          <w:sz w:val="22"/>
+        </w:rPr>
+        <w:t>Forecasted for 55 advertisers</w:t>
+      </w:r>
+      <w:r>
+        <w:rPr>
+          <w:b w:val="0"/>
+          <w:sz w:val="22"/>
+        </w:rPr>
+        <w:t xml:space="preserve"> so far in 2026, with impactful allocations and strong communication with the media plan and adops teams.</w:t>
+      </w:r>
+    </w:p>
+    <w:p>
+      <w:pPr>
+        <w:spacing w:before="240" w:after="80"/>
+        <w:pBdr>
+          <w:bottom w:val="single" w:sz="6" w:space="1" w:color="D0D7E5"/>
+        </w:pBdr>
+      </w:pPr>
+      <w:r>
+        <w:rPr>
+          <w:b/>
+          <w:color w:val="1F3864"/>
+          <w:sz w:val="28"/>
+        </w:rPr>
+        <w:t>Automation (Time Saved for the Team)</w:t>
+      </w:r>
+    </w:p>
+    <w:p>
+      <w:pPr>
+        <w:pStyle w:val="ListBullet"/>
+        <w:spacing w:after="60"/>
+      </w:pPr>
+      <w:r>
+        <w:rPr>
+          <w:b/>
+          <w:sz w:val="22"/>
+        </w:rPr>
+        <w:t>Daily monitoring</w:t>
+      </w:r>
+      <w:r>
+        <w:rPr>
+          <w:b w:val="0"/>
+          <w:sz w:val="22"/>
+        </w:rPr>
+        <w:t xml:space="preserve"> — Automated manual monitoring, saving the team </w:t>
       </w:r>
       <w:r>
         <w:rPr>
           <w:b/>
           <w:sz w:val="22"/>
         </w:rPr>
-        <w:t>December leave</w:t>
+        <w:t>~2 hours per day</w:t>
       </w:r>
       <w:r>
         <w:rPr>
           <w:b w:val="0"/>
           <w:sz w:val="22"/>
         </w:rPr>
-        <w:t xml:space="preserve"> on client tasks — the only trained POC for the sales and adops teams on avails and delivery.</w:t>
+        <w:t>.</w:t>
+      </w:r>
+    </w:p>
+    <w:p>
+      <w:pPr>
+        <w:pStyle w:val="ListBullet"/>
+        <w:spacing w:after="60"/>
+      </w:pPr>
+      <w:r>
+        <w:rPr>
+          <w:b/>
+          <w:sz w:val="22"/>
+        </w:rPr>
+        <w:t>WOW inventory forecasting / avails</w:t>
+      </w:r>
+      <w:r>
+        <w:rPr>
+          <w:b w:val="0"/>
+          <w:sz w:val="22"/>
+        </w:rPr>
+        <w:t xml:space="preserve"> — Automated a Monday task that took </w:t>
+      </w:r>
+      <w:r>
+        <w:rPr>
+          <w:b/>
+          <w:sz w:val="22"/>
+        </w:rPr>
+        <w:t>~4 hours every week</w:t>
+      </w:r>
+      <w:r>
+        <w:rPr>
+          <w:b w:val="0"/>
+          <w:sz w:val="22"/>
+        </w:rPr>
+        <w:t>; the client now uses it on a daily basis.</w:t>
+      </w:r>
+    </w:p>
+    <w:p>
+      <w:pPr>
+        <w:pStyle w:val="ListBullet"/>
+        <w:spacing w:after="60"/>
+      </w:pPr>
+      <w:r>
+        <w:rPr>
+          <w:b/>
+          <w:sz w:val="22"/>
+        </w:rPr>
+        <w:t>HPTO date tracking</w:t>
+      </w:r>
+      <w:r>
+        <w:rPr>
+          <w:b w:val="0"/>
+          <w:sz w:val="22"/>
+        </w:rPr>
+        <w:t xml:space="preserve"> — Turned a hectic calendar-tracking task into a managed, automated process.</w:t>
       </w:r>
     </w:p>
     <w:p>
       <w:pPr>
         <w:spacing w:before="240" w:after="80"/>
         <w:pBdr>
-          <w:bottom w:val="single" w:sz="6" w:space="2" w:color="D0D7E5"/>
+          <w:bottom w:val="single" w:sz="6" w:space="1" w:color="D0D7E5"/>
         </w:pBdr>
       </w:pPr>
       <w:r>
@@ -857,13 +1348,14 @@
         <w:tblLook w:firstColumn="1" w:firstRow="1" w:lastColumn="0" w:lastRow="0" w:noHBand="0" w:noVBand="1" w:val="04A0"/>
       </w:tblPr>
       <w:tblGrid>
-        <w:gridCol w:w="4968"/>
-        <w:gridCol w:w="4968"/>
+        <w:gridCol w:w="3312"/>
+        <w:gridCol w:w="3312"/>
+        <w:gridCol w:w="3312"/>
       </w:tblGrid>
       <w:tr>
         <w:tc>
           <w:tcPr>
-            <w:tcW w:type="dxa" w:w="3312"/>
+            <w:tcW w:type="dxa" w:w="1152"/>
             <w:tcMar>
               <w:top w:w="80" w:type="dxa"/>
               <w:bottom w:w="80" w:type="dxa"/>
@@ -878,15 +1370,15 @@
               <w:rPr>
                 <w:b/>
                 <w:color w:val="FFFFFF"/>
-                <w:sz w:val="21"/>
+                <w:sz w:val="20"/>
               </w:rPr>
-              <w:t>Area</w:t>
+              <w:t>Year</w:t>
             </w:r>
           </w:p>
         </w:tc>
         <w:tc>
           <w:tcPr>
-            <w:tcW w:type="dxa" w:w="6336"/>
+            <w:tcW w:type="dxa" w:w="3168"/>
             <w:tcMar>
               <w:top w:w="80" w:type="dxa"/>
               <w:bottom w:w="80" w:type="dxa"/>
@@ -901,7 +1393,30 @@
               <w:rPr>
                 <w:b/>
                 <w:color w:val="FFFFFF"/>
-                <w:sz w:val="21"/>
+                <w:sz w:val="20"/>
+              </w:rPr>
+              <w:t>Area</w:t>
+            </w:r>
+          </w:p>
+        </w:tc>
+        <w:tc>
+          <w:tcPr>
+            <w:tcW w:type="dxa" w:w="5328"/>
+            <w:tcMar>
+              <w:top w:w="80" w:type="dxa"/>
+              <w:bottom w:w="80" w:type="dxa"/>
+              <w:start w:w="120" w:type="dxa"/>
+              <w:end w:w="120" w:type="dxa"/>
+            </w:tcMar>
+            <w:shd w:val="clear" w:color="auto" w:fill="1F3864"/>
+          </w:tcPr>
+          <w:p>
+            <w:r/>
+            <w:r>
+              <w:rPr>
+                <w:b/>
+                <w:color w:val="FFFFFF"/>
+                <w:sz w:val="20"/>
               </w:rPr>
               <w:t>Result</w:t>
             </w:r>
@@ -911,7 +1426,7 @@
       <w:tr>
         <w:tc>
           <w:tcPr>
-            <w:tcW w:type="dxa" w:w="3312"/>
+            <w:tcW w:type="dxa" w:w="1152"/>
             <w:tcMar>
               <w:top w:w="80" w:type="dxa"/>
               <w:bottom w:w="80" w:type="dxa"/>
@@ -926,15 +1441,15 @@
               <w:rPr>
                 <w:b/>
                 <w:color w:val="1F3864"/>
-                <w:sz w:val="21"/>
+                <w:sz w:val="20"/>
               </w:rPr>
-              <w:t>Q4 inventory sold</w:t>
+              <w:t>2025</w:t>
             </w:r>
           </w:p>
         </w:tc>
         <w:tc>
           <w:tcPr>
-            <w:tcW w:type="dxa" w:w="6336"/>
+            <w:tcW w:type="dxa" w:w="3168"/>
             <w:tcMar>
               <w:top w:w="80" w:type="dxa"/>
               <w:bottom w:w="80" w:type="dxa"/>
@@ -947,7 +1462,30 @@
             <w:r/>
             <w:r>
               <w:rPr>
-                <w:sz w:val="21"/>
+                <w:b/>
+                <w:color w:val="1F3864"/>
+                <w:sz w:val="20"/>
+              </w:rPr>
+              <w:t>Q4 inventory sold</w:t>
+            </w:r>
+          </w:p>
+        </w:tc>
+        <w:tc>
+          <w:tcPr>
+            <w:tcW w:type="dxa" w:w="5328"/>
+            <w:tcMar>
+              <w:top w:w="80" w:type="dxa"/>
+              <w:bottom w:w="80" w:type="dxa"/>
+              <w:start w:w="120" w:type="dxa"/>
+              <w:end w:w="120" w:type="dxa"/>
+            </w:tcMar>
+            <w:shd w:val="clear" w:color="auto" w:fill="F2F5FA"/>
+          </w:tcPr>
+          <w:p>
+            <w:r/>
+            <w:r>
+              <w:rPr>
+                <w:sz w:val="20"/>
               </w:rPr>
               <w:t>90%, via forecasting + avails dashboard</w:t>
             </w:r>
@@ -957,7 +1495,7 @@
       <w:tr>
         <w:tc>
           <w:tcPr>
-            <w:tcW w:type="dxa" w:w="3312"/>
+            <w:tcW w:type="dxa" w:w="1152"/>
             <w:tcMar>
               <w:top w:w="80" w:type="dxa"/>
               <w:bottom w:w="80" w:type="dxa"/>
@@ -972,15 +1510,15 @@
               <w:rPr>
                 <w:b/>
                 <w:color w:val="1F3864"/>
-                <w:sz w:val="21"/>
+                <w:sz w:val="20"/>
               </w:rPr>
-              <w:t>Advertisers supported</w:t>
+              <w:t>2025</w:t>
             </w:r>
           </w:p>
         </w:tc>
         <w:tc>
           <w:tcPr>
-            <w:tcW w:type="dxa" w:w="6336"/>
+            <w:tcW w:type="dxa" w:w="3168"/>
             <w:tcMar>
               <w:top w:w="80" w:type="dxa"/>
               <w:bottom w:w="80" w:type="dxa"/>
@@ -993,9 +1531,32 @@
             <w:r/>
             <w:r>
               <w:rPr>
-                <w:sz w:val="21"/>
+                <w:b/>
+                <w:color w:val="1F3864"/>
+                <w:sz w:val="20"/>
               </w:rPr>
-              <w:t>55 in 2025</w:t>
+              <w:t>Advertisers supported</w:t>
+            </w:r>
+          </w:p>
+        </w:tc>
+        <w:tc>
+          <w:tcPr>
+            <w:tcW w:type="dxa" w:w="5328"/>
+            <w:tcMar>
+              <w:top w:w="80" w:type="dxa"/>
+              <w:bottom w:w="80" w:type="dxa"/>
+              <w:start w:w="120" w:type="dxa"/>
+              <w:end w:w="120" w:type="dxa"/>
+            </w:tcMar>
+            <w:shd w:val="clear" w:color="auto" w:fill="FFFFFF"/>
+          </w:tcPr>
+          <w:p>
+            <w:r/>
+            <w:r>
+              <w:rPr>
+                <w:sz w:val="20"/>
+              </w:rPr>
+              <w:t>55</w:t>
             </w:r>
           </w:p>
         </w:tc>
@@ -1003,7 +1564,7 @@
       <w:tr>
         <w:tc>
           <w:tcPr>
-            <w:tcW w:type="dxa" w:w="3312"/>
+            <w:tcW w:type="dxa" w:w="1152"/>
             <w:tcMar>
               <w:top w:w="80" w:type="dxa"/>
               <w:bottom w:w="80" w:type="dxa"/>
@@ -1018,15 +1579,15 @@
               <w:rPr>
                 <w:b/>
                 <w:color w:val="1F3864"/>
-                <w:sz w:val="21"/>
+                <w:sz w:val="20"/>
               </w:rPr>
-              <w:t>Overselling (HPTO)</w:t>
+              <w:t>2025</w:t>
             </w:r>
           </w:p>
         </w:tc>
         <w:tc>
           <w:tcPr>
-            <w:tcW w:type="dxa" w:w="6336"/>
+            <w:tcW w:type="dxa" w:w="3168"/>
             <w:tcMar>
               <w:top w:w="80" w:type="dxa"/>
               <w:bottom w:w="80" w:type="dxa"/>
@@ -1039,7 +1600,30 @@
             <w:r/>
             <w:r>
               <w:rPr>
-                <w:sz w:val="21"/>
+                <w:b/>
+                <w:color w:val="1F3864"/>
+                <w:sz w:val="20"/>
+              </w:rPr>
+              <w:t>Overselling (HPTO)</w:t>
+            </w:r>
+          </w:p>
+        </w:tc>
+        <w:tc>
+          <w:tcPr>
+            <w:tcW w:type="dxa" w:w="5328"/>
+            <w:tcMar>
+              <w:top w:w="80" w:type="dxa"/>
+              <w:bottom w:w="80" w:type="dxa"/>
+              <w:start w:w="120" w:type="dxa"/>
+              <w:end w:w="120" w:type="dxa"/>
+            </w:tcMar>
+            <w:shd w:val="clear" w:color="auto" w:fill="F2F5FA"/>
+          </w:tcPr>
+          <w:p>
+            <w:r/>
+            <w:r>
+              <w:rPr>
+                <w:sz w:val="20"/>
               </w:rPr>
               <w:t>Eliminated via calendar-data dashboard</w:t>
             </w:r>
@@ -1049,7 +1633,7 @@
       <w:tr>
         <w:tc>
           <w:tcPr>
-            <w:tcW w:type="dxa" w:w="3312"/>
+            <w:tcW w:type="dxa" w:w="1152"/>
             <w:tcMar>
               <w:top w:w="80" w:type="dxa"/>
               <w:bottom w:w="80" w:type="dxa"/>
@@ -1064,15 +1648,15 @@
               <w:rPr>
                 <w:b/>
                 <w:color w:val="1F3864"/>
-                <w:sz w:val="21"/>
+                <w:sz w:val="20"/>
               </w:rPr>
-              <w:t>Escalations</w:t>
+              <w:t>2025</w:t>
             </w:r>
           </w:p>
         </w:tc>
         <w:tc>
           <w:tcPr>
-            <w:tcW w:type="dxa" w:w="6336"/>
+            <w:tcW w:type="dxa" w:w="3168"/>
             <w:tcMar>
               <w:top w:w="80" w:type="dxa"/>
               <w:bottom w:w="80" w:type="dxa"/>
@@ -1085,9 +1669,32 @@
             <w:r/>
             <w:r>
               <w:rPr>
-                <w:sz w:val="21"/>
+                <w:b/>
+                <w:color w:val="1F3864"/>
+                <w:sz w:val="20"/>
               </w:rPr>
-              <w:t>Zero</w:t>
+              <w:t>LinkedIn campaign</w:t>
+            </w:r>
+          </w:p>
+        </w:tc>
+        <w:tc>
+          <w:tcPr>
+            <w:tcW w:type="dxa" w:w="5328"/>
+            <w:tcMar>
+              <w:top w:w="80" w:type="dxa"/>
+              <w:bottom w:w="80" w:type="dxa"/>
+              <w:start w:w="120" w:type="dxa"/>
+              <w:end w:w="120" w:type="dxa"/>
+            </w:tcMar>
+            <w:shd w:val="clear" w:color="auto" w:fill="FFFFFF"/>
+          </w:tcPr>
+          <w:p>
+            <w:r/>
+            <w:r>
+              <w:rPr>
+                <w:sz w:val="20"/>
+              </w:rPr>
+              <w:t>Delivered in full, solo (no MP)</w:t>
             </w:r>
           </w:p>
         </w:tc>
@@ -1095,7 +1702,7 @@
       <w:tr>
         <w:tc>
           <w:tcPr>
-            <w:tcW w:type="dxa" w:w="3312"/>
+            <w:tcW w:type="dxa" w:w="1152"/>
             <w:tcMar>
               <w:top w:w="80" w:type="dxa"/>
               <w:bottom w:w="80" w:type="dxa"/>
@@ -1110,15 +1717,15 @@
               <w:rPr>
                 <w:b/>
                 <w:color w:val="1F3864"/>
-                <w:sz w:val="21"/>
+                <w:sz w:val="20"/>
               </w:rPr>
-              <w:t>Campaign delivery</w:t>
+              <w:t>2025</w:t>
             </w:r>
           </w:p>
         </w:tc>
         <w:tc>
           <w:tcPr>
-            <w:tcW w:type="dxa" w:w="6336"/>
+            <w:tcW w:type="dxa" w:w="3168"/>
             <w:tcMar>
               <w:top w:w="80" w:type="dxa"/>
               <w:bottom w:w="80" w:type="dxa"/>
@@ -1131,9 +1738,32 @@
             <w:r/>
             <w:r>
               <w:rPr>
-                <w:sz w:val="21"/>
+                <w:b/>
+                <w:color w:val="1F3864"/>
+                <w:sz w:val="20"/>
               </w:rPr>
-              <w:t>Delivered in full, including LinkedIn (solo, no MP)</w:t>
+              <w:t>SSP enablement</w:t>
+            </w:r>
+          </w:p>
+        </w:tc>
+        <w:tc>
+          <w:tcPr>
+            <w:tcW w:type="dxa" w:w="5328"/>
+            <w:tcMar>
+              <w:top w:w="80" w:type="dxa"/>
+              <w:bottom w:w="80" w:type="dxa"/>
+              <w:start w:w="120" w:type="dxa"/>
+              <w:end w:w="120" w:type="dxa"/>
+            </w:tcMar>
+            <w:shd w:val="clear" w:color="auto" w:fill="F2F5FA"/>
+          </w:tcPr>
+          <w:p>
+            <w:r/>
+            <w:r>
+              <w:rPr>
+                <w:sz w:val="20"/>
+              </w:rPr>
+              <w:t>KT + docs + daily monitoring dashboard for Nativo</w:t>
             </w:r>
           </w:p>
         </w:tc>
@@ -1141,7 +1771,7 @@
       <w:tr>
         <w:tc>
           <w:tcPr>
-            <w:tcW w:type="dxa" w:w="3312"/>
+            <w:tcW w:type="dxa" w:w="1152"/>
             <w:tcMar>
               <w:top w:w="80" w:type="dxa"/>
               <w:bottom w:w="80" w:type="dxa"/>
@@ -1156,15 +1786,15 @@
               <w:rPr>
                 <w:b/>
                 <w:color w:val="1F3864"/>
-                <w:sz w:val="21"/>
+                <w:sz w:val="20"/>
               </w:rPr>
-              <w:t>Optimizations implemented</w:t>
+              <w:t>2026</w:t>
             </w:r>
           </w:p>
         </w:tc>
         <w:tc>
           <w:tcPr>
-            <w:tcW w:type="dxa" w:w="6336"/>
+            <w:tcW w:type="dxa" w:w="3168"/>
             <w:tcMar>
               <w:top w:w="80" w:type="dxa"/>
               <w:bottom w:w="80" w:type="dxa"/>
@@ -1177,9 +1807,32 @@
             <w:r/>
             <w:r>
               <w:rPr>
-                <w:sz w:val="21"/>
+                <w:b/>
+                <w:color w:val="1F3864"/>
+                <w:sz w:val="20"/>
               </w:rPr>
-              <w:t>Ad Refresh, Batch SRA (↑ programmatic CPM), Bytes placements</w:t>
+              <w:t>ENVU project</w:t>
+            </w:r>
+          </w:p>
+        </w:tc>
+        <w:tc>
+          <w:tcPr>
+            <w:tcW w:type="dxa" w:w="5328"/>
+            <w:tcMar>
+              <w:top w:w="80" w:type="dxa"/>
+              <w:bottom w:w="80" w:type="dxa"/>
+              <w:start w:w="120" w:type="dxa"/>
+              <w:end w:w="120" w:type="dxa"/>
+            </w:tcMar>
+            <w:shd w:val="clear" w:color="auto" w:fill="FFFFFF"/>
+          </w:tcPr>
+          <w:p>
+            <w:r/>
+            <w:r>
+              <w:rPr>
+                <w:sz w:val="20"/>
+              </w:rPr>
+              <w:t>Led solo; playbooks, AI voice-over videos, metrics matrix, offline form</w:t>
             </w:r>
           </w:p>
         </w:tc>
@@ -1187,7 +1840,7 @@
       <w:tr>
         <w:tc>
           <w:tcPr>
-            <w:tcW w:type="dxa" w:w="3312"/>
+            <w:tcW w:type="dxa" w:w="1152"/>
             <w:tcMar>
               <w:top w:w="80" w:type="dxa"/>
               <w:bottom w:w="80" w:type="dxa"/>
@@ -1202,15 +1855,15 @@
               <w:rPr>
                 <w:b/>
                 <w:color w:val="1F3864"/>
-                <w:sz w:val="21"/>
+                <w:sz w:val="20"/>
               </w:rPr>
-              <w:t>Enablement</w:t>
+              <w:t>2026</w:t>
             </w:r>
           </w:p>
         </w:tc>
         <w:tc>
           <w:tcPr>
-            <w:tcW w:type="dxa" w:w="6336"/>
+            <w:tcW w:type="dxa" w:w="3168"/>
             <w:tcMar>
               <w:top w:w="80" w:type="dxa"/>
               <w:bottom w:w="80" w:type="dxa"/>
@@ -1223,9 +1876,32 @@
             <w:r/>
             <w:r>
               <w:rPr>
-                <w:sz w:val="21"/>
+                <w:b/>
+                <w:color w:val="1F3864"/>
+                <w:sz w:val="20"/>
               </w:rPr>
-              <w:t>SSP KT + docs for Nativo team; daily monitoring dashboard</w:t>
+              <w:t>Ad Boost vs. Booster audit</w:t>
+            </w:r>
+          </w:p>
+        </w:tc>
+        <w:tc>
+          <w:tcPr>
+            <w:tcW w:type="dxa" w:w="5328"/>
+            <w:tcMar>
+              <w:top w:w="80" w:type="dxa"/>
+              <w:bottom w:w="80" w:type="dxa"/>
+              <w:start w:w="120" w:type="dxa"/>
+              <w:end w:w="120" w:type="dxa"/>
+            </w:tcMar>
+            <w:shd w:val="clear" w:color="auto" w:fill="F2F5FA"/>
+          </w:tcPr>
+          <w:p>
+            <w:r/>
+            <w:r>
+              <w:rPr>
+                <w:sz w:val="20"/>
+              </w:rPr>
+              <w:t>Owned end-to-end; praised by client and CEO</w:t>
             </w:r>
           </w:p>
         </w:tc>
@@ -1233,7 +1909,7 @@
       <w:tr>
         <w:tc>
           <w:tcPr>
-            <w:tcW w:type="dxa" w:w="3312"/>
+            <w:tcW w:type="dxa" w:w="1152"/>
             <w:tcMar>
               <w:top w:w="80" w:type="dxa"/>
               <w:bottom w:w="80" w:type="dxa"/>
@@ -1248,15 +1924,15 @@
               <w:rPr>
                 <w:b/>
                 <w:color w:val="1F3864"/>
-                <w:sz w:val="21"/>
+                <w:sz w:val="20"/>
               </w:rPr>
-              <w:t>Backup</w:t>
+              <w:t>2026</w:t>
             </w:r>
           </w:p>
         </w:tc>
         <w:tc>
           <w:tcPr>
-            <w:tcW w:type="dxa" w:w="6336"/>
+            <w:tcW w:type="dxa" w:w="3168"/>
             <w:tcMar>
               <w:top w:w="80" w:type="dxa"/>
               <w:bottom w:w="80" w:type="dxa"/>
@@ -1269,7 +1945,237 @@
             <w:r/>
             <w:r>
               <w:rPr>
-                <w:sz w:val="21"/>
+                <w:b/>
+                <w:color w:val="1F3864"/>
+                <w:sz w:val="20"/>
+              </w:rPr>
+              <w:t>Automation</w:t>
+            </w:r>
+          </w:p>
+        </w:tc>
+        <w:tc>
+          <w:tcPr>
+            <w:tcW w:type="dxa" w:w="5328"/>
+            <w:tcMar>
+              <w:top w:w="80" w:type="dxa"/>
+              <w:bottom w:w="80" w:type="dxa"/>
+              <w:start w:w="120" w:type="dxa"/>
+              <w:end w:w="120" w:type="dxa"/>
+            </w:tcMar>
+            <w:shd w:val="clear" w:color="auto" w:fill="FFFFFF"/>
+          </w:tcPr>
+          <w:p>
+            <w:r/>
+            <w:r>
+              <w:rPr>
+                <w:sz w:val="20"/>
+              </w:rPr>
+              <w:t>~2 hrs/day (monitoring) + ~4 hrs/week (avails) saved</w:t>
+            </w:r>
+          </w:p>
+        </w:tc>
+      </w:tr>
+      <w:tr>
+        <w:tc>
+          <w:tcPr>
+            <w:tcW w:type="dxa" w:w="1152"/>
+            <w:tcMar>
+              <w:top w:w="80" w:type="dxa"/>
+              <w:bottom w:w="80" w:type="dxa"/>
+              <w:start w:w="120" w:type="dxa"/>
+              <w:end w:w="120" w:type="dxa"/>
+            </w:tcMar>
+            <w:shd w:val="clear" w:color="auto" w:fill="F2F5FA"/>
+          </w:tcPr>
+          <w:p>
+            <w:r/>
+            <w:r>
+              <w:rPr>
+                <w:b/>
+                <w:color w:val="1F3864"/>
+                <w:sz w:val="20"/>
+              </w:rPr>
+              <w:t>2026</w:t>
+            </w:r>
+          </w:p>
+        </w:tc>
+        <w:tc>
+          <w:tcPr>
+            <w:tcW w:type="dxa" w:w="3168"/>
+            <w:tcMar>
+              <w:top w:w="80" w:type="dxa"/>
+              <w:bottom w:w="80" w:type="dxa"/>
+              <w:start w:w="120" w:type="dxa"/>
+              <w:end w:w="120" w:type="dxa"/>
+            </w:tcMar>
+            <w:shd w:val="clear" w:color="auto" w:fill="F2F5FA"/>
+          </w:tcPr>
+          <w:p>
+            <w:r/>
+            <w:r>
+              <w:rPr>
+                <w:b/>
+                <w:color w:val="1F3864"/>
+                <w:sz w:val="20"/>
+              </w:rPr>
+              <w:t>Advertisers forecasted</w:t>
+            </w:r>
+          </w:p>
+        </w:tc>
+        <w:tc>
+          <w:tcPr>
+            <w:tcW w:type="dxa" w:w="5328"/>
+            <w:tcMar>
+              <w:top w:w="80" w:type="dxa"/>
+              <w:bottom w:w="80" w:type="dxa"/>
+              <w:start w:w="120" w:type="dxa"/>
+              <w:end w:w="120" w:type="dxa"/>
+            </w:tcMar>
+            <w:shd w:val="clear" w:color="auto" w:fill="F2F5FA"/>
+          </w:tcPr>
+          <w:p>
+            <w:r/>
+            <w:r>
+              <w:rPr>
+                <w:sz w:val="20"/>
+              </w:rPr>
+              <w:t>55</w:t>
+            </w:r>
+          </w:p>
+        </w:tc>
+      </w:tr>
+      <w:tr>
+        <w:tc>
+          <w:tcPr>
+            <w:tcW w:type="dxa" w:w="1152"/>
+            <w:tcMar>
+              <w:top w:w="80" w:type="dxa"/>
+              <w:bottom w:w="80" w:type="dxa"/>
+              <w:start w:w="120" w:type="dxa"/>
+              <w:end w:w="120" w:type="dxa"/>
+            </w:tcMar>
+            <w:shd w:val="clear" w:color="auto" w:fill="FFFFFF"/>
+          </w:tcPr>
+          <w:p>
+            <w:r/>
+            <w:r>
+              <w:rPr>
+                <w:b/>
+                <w:color w:val="1F3864"/>
+                <w:sz w:val="20"/>
+              </w:rPr>
+              <w:t>2026</w:t>
+            </w:r>
+          </w:p>
+        </w:tc>
+        <w:tc>
+          <w:tcPr>
+            <w:tcW w:type="dxa" w:w="3168"/>
+            <w:tcMar>
+              <w:top w:w="80" w:type="dxa"/>
+              <w:bottom w:w="80" w:type="dxa"/>
+              <w:start w:w="120" w:type="dxa"/>
+              <w:end w:w="120" w:type="dxa"/>
+            </w:tcMar>
+            <w:shd w:val="clear" w:color="auto" w:fill="FFFFFF"/>
+          </w:tcPr>
+          <w:p>
+            <w:r/>
+            <w:r>
+              <w:rPr>
+                <w:b/>
+                <w:color w:val="1F3864"/>
+                <w:sz w:val="20"/>
+              </w:rPr>
+              <w:t>Training</w:t>
+            </w:r>
+          </w:p>
+        </w:tc>
+        <w:tc>
+          <w:tcPr>
+            <w:tcW w:type="dxa" w:w="5328"/>
+            <w:tcMar>
+              <w:top w:w="80" w:type="dxa"/>
+              <w:bottom w:w="80" w:type="dxa"/>
+              <w:start w:w="120" w:type="dxa"/>
+              <w:end w:w="120" w:type="dxa"/>
+            </w:tcMar>
+            <w:shd w:val="clear" w:color="auto" w:fill="FFFFFF"/>
+          </w:tcPr>
+          <w:p>
+            <w:r/>
+            <w:r>
+              <w:rPr>
+                <w:sz w:val="20"/>
+              </w:rPr>
+              <w:t>Trained Pandey in inventory management</w:t>
+            </w:r>
+          </w:p>
+        </w:tc>
+      </w:tr>
+      <w:tr>
+        <w:tc>
+          <w:tcPr>
+            <w:tcW w:type="dxa" w:w="1152"/>
+            <w:tcMar>
+              <w:top w:w="80" w:type="dxa"/>
+              <w:bottom w:w="80" w:type="dxa"/>
+              <w:start w:w="120" w:type="dxa"/>
+              <w:end w:w="120" w:type="dxa"/>
+            </w:tcMar>
+            <w:shd w:val="clear" w:color="auto" w:fill="F2F5FA"/>
+          </w:tcPr>
+          <w:p>
+            <w:r/>
+            <w:r>
+              <w:rPr>
+                <w:b/>
+                <w:color w:val="1F3864"/>
+                <w:sz w:val="20"/>
+              </w:rPr>
+              <w:t>Both</w:t>
+            </w:r>
+          </w:p>
+        </w:tc>
+        <w:tc>
+          <w:tcPr>
+            <w:tcW w:type="dxa" w:w="3168"/>
+            <w:tcMar>
+              <w:top w:w="80" w:type="dxa"/>
+              <w:bottom w:w="80" w:type="dxa"/>
+              <w:start w:w="120" w:type="dxa"/>
+              <w:end w:w="120" w:type="dxa"/>
+            </w:tcMar>
+            <w:shd w:val="clear" w:color="auto" w:fill="F2F5FA"/>
+          </w:tcPr>
+          <w:p>
+            <w:r/>
+            <w:r>
+              <w:rPr>
+                <w:b/>
+                <w:color w:val="1F3864"/>
+                <w:sz w:val="20"/>
+              </w:rPr>
+              <w:t>Backup</w:t>
+            </w:r>
+          </w:p>
+        </w:tc>
+        <w:tc>
+          <w:tcPr>
+            <w:tcW w:type="dxa" w:w="5328"/>
+            <w:tcMar>
+              <w:top w:w="80" w:type="dxa"/>
+              <w:bottom w:w="80" w:type="dxa"/>
+              <w:start w:w="120" w:type="dxa"/>
+              <w:end w:w="120" w:type="dxa"/>
+            </w:tcMar>
+            <w:shd w:val="clear" w:color="auto" w:fill="F2F5FA"/>
+          </w:tcPr>
+          <w:p>
+            <w:r/>
+            <w:r>
+              <w:rPr>
+                <w:sz w:val="20"/>
               </w:rPr>
               <w:t>None — delivered as a single resource</w:t>
             </w:r>
@@ -1289,7 +2195,7 @@
           <w:color w:val="707070"/>
           <w:sz w:val="19"/>
         </w:rPr>
-        <w:t>Tip: Add hard numbers where possible (revenue $, CPM uplift %, line item counts, hours saved) to make the impact undeniable.</w:t>
+        <w:t>Tip: Add hard numbers where possible (revenue $, CPM uplift %, line item counts, onboarding time reduced) to make the impact undeniable.</w:t>
       </w:r>
     </w:p>
     <w:sectPr>

</xml_diff>